<commit_message>
fix(resume): remove TypeScript, CSS, Structured JSON Logging, Vite and streamline professional summary
</commit_message>
<xml_diff>
--- a/assets/Henry_Fadeni_Software_AI_Engineer_Resume.docx
+++ b/assets/Henry_Fadeni_Software_AI_Engineer_Resume.docx
@@ -76,7 +76,7 @@
         <w:rPr>
           <w:sz w:val="17"/>
         </w:rPr>
-        <w:t>Software &amp; AI Engineer with an Electrical &amp; Electronics Engineering foundation, specializing in production-grade LLM systems, evaluated RAG architectures, autonomous agent workflows (LangGraph), and high-throughput distributed backends. Experienced in building deterministic guardrails, human-in-the-loop controls, automated evaluation suites (Spider golden set), and observable backend architectures (FastAPI, Redis, Celery, DuckDB, WebSockets). Proven track record of shipping end-to-end applications from distributed system architecture to polished user interfaces (React, Next.js).</w:t>
+        <w:t>Software &amp; AI Engineer with an Electrical &amp; Electronics Engineering foundation, specializing in production-grade LLM systems, evaluated RAG architectures, autonomous agent workflows, and high-throughput distributed backends. Experienced in building deterministic guardrails, human-in-the-loop controls, automated evaluation suites, and observable asynchronous backend pipelines. Proven track record of shipping end-to-end applications from distributed backend architecture to polished user interfaces.</w:t>
       </w:r>
     </w:p>
     <w:p>
@@ -112,7 +112,7 @@
         <w:rPr>
           <w:sz w:val="16"/>
         </w:rPr>
-        <w:t>Python, SQL (PostgreSQL, DuckDB, SQLite), JavaScript, TypeScript, MATLAB, HTML5, CSS3</w:t>
+        <w:t>Python, SQL (PostgreSQL, DuckDB, SQLite), JavaScript, MATLAB, HTML5</w:t>
       </w:r>
     </w:p>
     <w:p>
@@ -169,7 +169,7 @@
         <w:rPr>
           <w:sz w:val="16"/>
         </w:rPr>
-        <w:t>React, Next.js, Vite, TypeScript, Tailwind CSS, Responsive Design, State Management, Interactive Data Dashboards</w:t>
+        <w:t>React, Next.js, Tailwind CSS, Responsive Design, State Management, Interactive Data Dashboards</w:t>
       </w:r>
     </w:p>
     <w:p>
@@ -188,7 +188,7 @@
         <w:rPr>
           <w:sz w:val="16"/>
         </w:rPr>
-        <w:t>AWS, Cloudflare, Docker, Docker Compose, GitHub Actions (CI/CD), Git, GitHub, Pytest (80%+ CI Coverage Gates), Prometheus, Grafana, Structured JSON Logging, Loki, Supabase, Vercel</w:t>
+        <w:t>AWS, Cloudflare, Docker, Docker Compose, GitHub Actions (CI/CD), Git, GitHub, Pytest (80%+ CI Coverage Gates), Prometheus, Grafana, Loki, Supabase, Vercel</w:t>
       </w:r>
     </w:p>
     <w:p>

</xml_diff>

<commit_message>
fix(resume): remove HTML5, ETL Pipelines, Tailwind CSS, GitHub, and Docker Compose
</commit_message>
<xml_diff>
--- a/assets/Henry_Fadeni_Software_AI_Engineer_Resume.docx
+++ b/assets/Henry_Fadeni_Software_AI_Engineer_Resume.docx
@@ -112,7 +112,7 @@
         <w:rPr>
           <w:sz w:val="16"/>
         </w:rPr>
-        <w:t>Python, SQL (PostgreSQL, DuckDB, SQLite), JavaScript, MATLAB, HTML5</w:t>
+        <w:t>Python, SQL (PostgreSQL, DuckDB, SQLite), JavaScript, MATLAB</w:t>
       </w:r>
     </w:p>
     <w:p>
@@ -150,7 +150,7 @@
         <w:rPr>
           <w:sz w:val="16"/>
         </w:rPr>
-        <w:t>FastAPI, WebSockets, RESTful APIs, Server-Sent Events (SSE), Celery, Redis (Pub/Sub, Caching, Sliding-Window Rate Limiting), AsyncIO, DuckDB, PostgreSQL, SQLite, Alembic, Pandas, PySpark, ETL Pipelines</w:t>
+        <w:t>FastAPI, WebSockets, RESTful APIs, Server-Sent Events (SSE), Celery, Redis (Pub/Sub, Caching, Sliding-Window Rate Limiting), AsyncIO, DuckDB, PostgreSQL, SQLite, Alembic, Pandas, PySpark</w:t>
       </w:r>
     </w:p>
     <w:p>
@@ -169,7 +169,7 @@
         <w:rPr>
           <w:sz w:val="16"/>
         </w:rPr>
-        <w:t>React, Next.js, Tailwind CSS, Responsive Design, State Management, Interactive Data Dashboards</w:t>
+        <w:t>React, Next.js, Responsive Design, State Management, Interactive Data Dashboards</w:t>
       </w:r>
     </w:p>
     <w:p>
@@ -188,7 +188,7 @@
         <w:rPr>
           <w:sz w:val="16"/>
         </w:rPr>
-        <w:t>AWS, Cloudflare, Docker, Docker Compose, GitHub Actions (CI/CD), Git, GitHub, Pytest (80%+ CI Coverage Gates), Prometheus, Grafana, Loki, Supabase, Vercel</w:t>
+        <w:t>AWS, Cloudflare, Docker, GitHub Actions (CI/CD), Git, Pytest (80%+ CI Coverage Gates), Prometheus, Grafana, Loki, Supabase, Vercel</w:t>
       </w:r>
     </w:p>
     <w:p>

</xml_diff>

<commit_message>
Update resume section spacing and regenerate 1-page PDF and DOCX
</commit_message>
<xml_diff>
--- a/assets/Henry_Fadeni_Software_AI_Engineer_Resume.docx
+++ b/assets/Henry_Fadeni_Software_AI_Engineer_Resume.docx
@@ -4,21 +4,21 @@
   <w:body>
     <w:p>
       <w:pPr>
-        <w:spacing w:before="0" w:after="10"/>
+        <w:spacing w:before="0" w:after="20"/>
         <w:jc w:val="center"/>
       </w:pPr>
       <w:r>
         <w:rPr>
           <w:b/>
           <w:color w:val="0F172A"/>
-          <w:sz w:val="30"/>
+          <w:sz w:val="29"/>
         </w:rPr>
         <w:t>TAIWO HENRY FADENI</w:t>
       </w:r>
     </w:p>
     <w:p>
       <w:pPr>
-        <w:spacing w:before="0" w:after="30"/>
+        <w:spacing w:before="0" w:after="40"/>
         <w:jc w:val="center"/>
       </w:pPr>
       <w:r>
@@ -32,7 +32,7 @@
     </w:p>
     <w:p>
       <w:pPr>
-        <w:spacing w:before="0" w:after="60"/>
+        <w:spacing w:before="0" w:after="80"/>
         <w:jc w:val="center"/>
       </w:pPr>
       <w:r>
@@ -54,7 +54,7 @@
     <w:p>
       <w:pPr>
         <w:keepNext/>
-        <w:spacing w:before="80" w:after="30"/>
+        <w:spacing w:before="60" w:after="50"/>
         <w:pBdr>
           <w:bottom w:val="single" w:sz="6" w:space="1" w:color="94A3B8"/>
         </w:pBdr>
@@ -74,7 +74,7 @@
       </w:pPr>
       <w:r>
         <w:rPr>
-          <w:sz w:val="17"/>
+          <w:sz w:val="16"/>
         </w:rPr>
         <w:t>Software &amp; AI Engineer with an Electrical &amp; Electronics Engineering foundation, specializing in production-grade LLM systems, evaluated RAG architectures, autonomous agent workflows, and high-throughput distributed backends. Experienced in building deterministic guardrails, human-in-the-loop controls, automated evaluation suites, and observable asynchronous backend pipelines. Proven track record of shipping end-to-end applications from distributed backend architecture to polished user interfaces.</w:t>
       </w:r>
@@ -82,7 +82,7 @@
     <w:p>
       <w:pPr>
         <w:keepNext/>
-        <w:spacing w:before="80" w:after="30"/>
+        <w:spacing w:before="190" w:after="50"/>
         <w:pBdr>
           <w:bottom w:val="single" w:sz="6" w:space="1" w:color="94A3B8"/>
         </w:pBdr>
@@ -98,7 +98,7 @@
     </w:p>
     <w:p>
       <w:pPr>
-        <w:spacing w:before="0" w:after="20" w:line="259" w:lineRule="auto"/>
+        <w:spacing w:before="0" w:after="30" w:line="259" w:lineRule="auto"/>
       </w:pPr>
       <w:r>
         <w:rPr>
@@ -117,7 +117,7 @@
     </w:p>
     <w:p>
       <w:pPr>
-        <w:spacing w:before="0" w:after="20" w:line="259" w:lineRule="auto"/>
+        <w:spacing w:before="0" w:after="30" w:line="259" w:lineRule="auto"/>
       </w:pPr>
       <w:r>
         <w:rPr>
@@ -136,7 +136,7 @@
     </w:p>
     <w:p>
       <w:pPr>
-        <w:spacing w:before="0" w:after="20" w:line="259" w:lineRule="auto"/>
+        <w:spacing w:before="0" w:after="30" w:line="259" w:lineRule="auto"/>
       </w:pPr>
       <w:r>
         <w:rPr>
@@ -155,7 +155,7 @@
     </w:p>
     <w:p>
       <w:pPr>
-        <w:spacing w:before="0" w:after="20" w:line="259" w:lineRule="auto"/>
+        <w:spacing w:before="0" w:after="30" w:line="259" w:lineRule="auto"/>
       </w:pPr>
       <w:r>
         <w:rPr>
@@ -174,7 +174,7 @@
     </w:p>
     <w:p>
       <w:pPr>
-        <w:spacing w:before="0" w:after="20" w:line="259" w:lineRule="auto"/>
+        <w:spacing w:before="0" w:after="30" w:line="259" w:lineRule="auto"/>
       </w:pPr>
       <w:r>
         <w:rPr>
@@ -194,7 +194,7 @@
     <w:p>
       <w:pPr>
         <w:keepNext/>
-        <w:spacing w:before="80" w:after="30"/>
+        <w:spacing w:before="190" w:after="50"/>
         <w:pBdr>
           <w:bottom w:val="single" w:sz="6" w:space="1" w:color="94A3B8"/>
         </w:pBdr>
@@ -232,13 +232,13 @@
           </w:tcPr>
           <w:p>
             <w:pPr>
-              <w:spacing w:before="40" w:after="10"/>
+              <w:spacing w:before="30" w:after="10"/>
             </w:pPr>
             <w:r>
               <w:rPr>
                 <w:b/>
                 <w:color w:val="0F172A"/>
-                <w:sz w:val="18"/>
+                <w:sz w:val="17"/>
               </w:rPr>
               <w:t>Retrieval-Augmented Analytics Dashboard (Text-to-SQL)</w:t>
             </w:r>
@@ -246,7 +246,7 @@
               <w:rPr>
                 <w:i/>
                 <w:color w:val="475569"/>
-                <w:sz w:val="17"/>
+                <w:sz w:val="16"/>
               </w:rPr>
               <w:t xml:space="preserve"> | FastAPI · DuckDB · sqlglot · Redis · SSE</w:t>
             </w:r>
@@ -264,14 +264,14 @@
           </w:tcPr>
           <w:p>
             <w:pPr>
-              <w:spacing w:before="40" w:after="10"/>
+              <w:spacing w:before="30" w:after="10"/>
               <w:jc w:val="right"/>
             </w:pPr>
             <w:r>
               <w:rPr>
                 <w:b/>
                 <w:color w:val="0F172A"/>
-                <w:sz w:val="17"/>
+                <w:sz w:val="16"/>
               </w:rPr>
               <w:t>2026</w:t>
             </w:r>
@@ -282,13 +282,13 @@
     <w:p>
       <w:pPr>
         <w:pStyle w:val="ListBullet"/>
-        <w:spacing w:before="0" w:after="20" w:line="259" w:lineRule="auto"/>
+        <w:spacing w:before="0" w:after="24" w:line="259" w:lineRule="auto"/>
         <w:ind w:left="259"/>
       </w:pPr>
       <w:r>
         <w:rPr>
           <w:color w:val="334155"/>
-          <w:sz w:val="17"/>
+          <w:sz w:val="16"/>
         </w:rPr>
         <w:t>Architected a natural-language to SQL analytics workspace executing sandboxed, read-only analytical queries against DuckDB with streamed SSE explanations and dynamic charts.</w:t>
       </w:r>
@@ -296,13 +296,13 @@
     <w:p>
       <w:pPr>
         <w:pStyle w:val="ListBullet"/>
-        <w:spacing w:before="0" w:after="20" w:line="259" w:lineRule="auto"/>
+        <w:spacing w:before="0" w:after="24" w:line="259" w:lineRule="auto"/>
         <w:ind w:left="259"/>
       </w:pPr>
       <w:r>
         <w:rPr>
           <w:color w:val="334155"/>
-          <w:sz w:val="17"/>
+          <w:sz w:val="16"/>
         </w:rPr>
         <w:t>Built a 2-stage AST validation pipeline using sqlglot (enforcing table/column verification, write-query rejection, and injection safeguards) with self-correction retry logic.</w:t>
       </w:r>
@@ -310,13 +310,13 @@
     <w:p>
       <w:pPr>
         <w:pStyle w:val="ListBullet"/>
-        <w:spacing w:before="0" w:after="20" w:line="259" w:lineRule="auto"/>
+        <w:spacing w:before="0" w:after="24" w:line="259" w:lineRule="auto"/>
         <w:ind w:left="259"/>
       </w:pPr>
       <w:r>
         <w:rPr>
           <w:color w:val="334155"/>
-          <w:sz w:val="17"/>
+          <w:sz w:val="16"/>
         </w:rPr>
         <w:t>Engineered an automated evaluation harness across an 80-pair Golden Set (adapted from Spider), achieving 96% SQL validity, 74% execution accuracy, 61% failure self-correction, and ~4.2s p95 latency.</w:t>
       </w:r>
@@ -345,13 +345,13 @@
           </w:tcPr>
           <w:p>
             <w:pPr>
-              <w:spacing w:before="40" w:after="10"/>
+              <w:spacing w:before="70" w:after="10"/>
             </w:pPr>
             <w:r>
               <w:rPr>
                 <w:b/>
                 <w:color w:val="0F172A"/>
-                <w:sz w:val="18"/>
+                <w:sz w:val="17"/>
               </w:rPr>
               <w:t>Autonomous AI Code Review Agent</w:t>
             </w:r>
@@ -359,7 +359,7 @@
               <w:rPr>
                 <w:i/>
                 <w:color w:val="475569"/>
-                <w:sz w:val="17"/>
+                <w:sz w:val="16"/>
               </w:rPr>
               <w:t xml:space="preserve"> | Python · FastAPI · LangGraph · Celery · Redis · Docker</w:t>
             </w:r>
@@ -377,14 +377,14 @@
           </w:tcPr>
           <w:p>
             <w:pPr>
-              <w:spacing w:before="40" w:after="10"/>
+              <w:spacing w:before="70" w:after="10"/>
               <w:jc w:val="right"/>
             </w:pPr>
             <w:r>
               <w:rPr>
                 <w:b/>
                 <w:color w:val="0F172A"/>
-                <w:sz w:val="17"/>
+                <w:sz w:val="16"/>
               </w:rPr>
               <w:t>2026</w:t>
             </w:r>
@@ -395,13 +395,13 @@
     <w:p>
       <w:pPr>
         <w:pStyle w:val="ListBullet"/>
-        <w:spacing w:before="0" w:after="20" w:line="259" w:lineRule="auto"/>
+        <w:spacing w:before="0" w:after="24" w:line="259" w:lineRule="auto"/>
         <w:ind w:left="259"/>
       </w:pPr>
       <w:r>
         <w:rPr>
           <w:color w:val="334155"/>
-          <w:sz w:val="17"/>
+          <w:sz w:val="16"/>
         </w:rPr>
         <w:t>Developed an event-driven GitHub App agent that parses pull-request diffs, retrieves relevant file context, and publishes line-level inline reviews and commit statuses.</w:t>
       </w:r>
@@ -409,13 +409,13 @@
     <w:p>
       <w:pPr>
         <w:pStyle w:val="ListBullet"/>
-        <w:spacing w:before="0" w:after="20" w:line="259" w:lineRule="auto"/>
+        <w:spacing w:before="0" w:after="24" w:line="259" w:lineRule="auto"/>
         <w:ind w:left="259"/>
       </w:pPr>
       <w:r>
         <w:rPr>
           <w:color w:val="334155"/>
-          <w:sz w:val="17"/>
+          <w:sz w:val="16"/>
         </w:rPr>
         <w:t>Implemented HMAC-SHA256 webhook verification, Redis sliding-window rate limiting, and asynchronous job queuing via Celery workers to decouple webhook intake from model inference.</w:t>
       </w:r>
@@ -423,13 +423,13 @@
     <w:p>
       <w:pPr>
         <w:pStyle w:val="ListBullet"/>
-        <w:spacing w:before="0" w:after="20" w:line="259" w:lineRule="auto"/>
+        <w:spacing w:before="0" w:after="24" w:line="259" w:lineRule="auto"/>
         <w:ind w:left="259"/>
       </w:pPr>
       <w:r>
         <w:rPr>
           <w:color w:val="334155"/>
-          <w:sz w:val="17"/>
+          <w:sz w:val="16"/>
         </w:rPr>
         <w:t>Built pluggable multi-provider LLM abstraction (OpenAI, Anthropic, Groq, Ollama), structured JSON validation, and an evaluation harness with an 80% CI code coverage gate.</w:t>
       </w:r>
@@ -458,13 +458,13 @@
           </w:tcPr>
           <w:p>
             <w:pPr>
-              <w:spacing w:before="40" w:after="10"/>
+              <w:spacing w:before="70" w:after="10"/>
             </w:pPr>
             <w:r>
               <w:rPr>
                 <w:b/>
                 <w:color w:val="0F172A"/>
-                <w:sz w:val="18"/>
+                <w:sz w:val="17"/>
               </w:rPr>
               <w:t>Self-Healing Microservices Monitor (Autonomous SRE Agent)</w:t>
             </w:r>
@@ -472,7 +472,7 @@
               <w:rPr>
                 <w:i/>
                 <w:color w:val="475569"/>
-                <w:sz w:val="17"/>
+                <w:sz w:val="16"/>
               </w:rPr>
               <w:t xml:space="preserve"> | LangGraph · ChromaDB · Prometheus · Postgres</w:t>
             </w:r>
@@ -490,14 +490,14 @@
           </w:tcPr>
           <w:p>
             <w:pPr>
-              <w:spacing w:before="40" w:after="10"/>
+              <w:spacing w:before="70" w:after="10"/>
               <w:jc w:val="right"/>
             </w:pPr>
             <w:r>
               <w:rPr>
                 <w:b/>
                 <w:color w:val="0F172A"/>
-                <w:sz w:val="17"/>
+                <w:sz w:val="16"/>
               </w:rPr>
               <w:t>2026</w:t>
             </w:r>
@@ -508,13 +508,13 @@
     <w:p>
       <w:pPr>
         <w:pStyle w:val="ListBullet"/>
-        <w:spacing w:before="0" w:after="20" w:line="259" w:lineRule="auto"/>
+        <w:spacing w:before="0" w:after="24" w:line="259" w:lineRule="auto"/>
         <w:ind w:left="259"/>
       </w:pPr>
       <w:r>
         <w:rPr>
           <w:color w:val="334155"/>
-          <w:sz w:val="17"/>
+          <w:sz w:val="16"/>
         </w:rPr>
         <w:t>Built an incident-response agent integrating Prometheus Alertmanager webhooks, LangGraph multi-step diagnosis, and ChromaDB vector runbook retrieval.</w:t>
       </w:r>
@@ -522,13 +522,13 @@
     <w:p>
       <w:pPr>
         <w:pStyle w:val="ListBullet"/>
-        <w:spacing w:before="0" w:after="20" w:line="259" w:lineRule="auto"/>
+        <w:spacing w:before="0" w:after="24" w:line="259" w:lineRule="auto"/>
         <w:ind w:left="259"/>
       </w:pPr>
       <w:r>
         <w:rPr>
           <w:color w:val="334155"/>
-          <w:sz w:val="17"/>
+          <w:sz w:val="16"/>
         </w:rPr>
         <w:t>Engineered a 4-condition deterministic policy gate (confidence &gt;= 0.75, allowlisted low-risk actions, impact checks, human approval routing) preventing destructive runaway executions with PostgreSQL audit trails.</w:t>
       </w:r>
@@ -536,13 +536,13 @@
     <w:p>
       <w:pPr>
         <w:pStyle w:val="ListBullet"/>
-        <w:spacing w:before="0" w:after="20" w:line="259" w:lineRule="auto"/>
+        <w:spacing w:before="0" w:after="24" w:line="259" w:lineRule="auto"/>
         <w:ind w:left="259"/>
       </w:pPr>
       <w:r>
         <w:rPr>
           <w:color w:val="334155"/>
-          <w:sz w:val="17"/>
+          <w:sz w:val="16"/>
         </w:rPr>
         <w:t>Achieved 100% (4/4) action and policy correctness across simulated failure scenarios with a live React operator dashboard.</w:t>
       </w:r>
@@ -571,13 +571,13 @@
           </w:tcPr>
           <w:p>
             <w:pPr>
-              <w:spacing w:before="40" w:after="10"/>
+              <w:spacing w:before="70" w:after="10"/>
             </w:pPr>
             <w:r>
               <w:rPr>
                 <w:b/>
                 <w:color w:val="0F172A"/>
-                <w:sz w:val="18"/>
+                <w:sz w:val="17"/>
               </w:rPr>
               <w:t>Realtime Multi-Room Chat Backend</w:t>
             </w:r>
@@ -585,7 +585,7 @@
               <w:rPr>
                 <w:i/>
                 <w:color w:val="475569"/>
-                <w:sz w:val="17"/>
+                <w:sz w:val="16"/>
               </w:rPr>
               <w:t xml:space="preserve"> | FastAPI · WebSockets · Redis Pub/Sub · SQLite · Docker</w:t>
             </w:r>
@@ -603,14 +603,14 @@
           </w:tcPr>
           <w:p>
             <w:pPr>
-              <w:spacing w:before="40" w:after="10"/>
+              <w:spacing w:before="70" w:after="10"/>
               <w:jc w:val="right"/>
             </w:pPr>
             <w:r>
               <w:rPr>
                 <w:b/>
                 <w:color w:val="0F172A"/>
-                <w:sz w:val="17"/>
+                <w:sz w:val="16"/>
               </w:rPr>
               <w:t>2026</w:t>
             </w:r>
@@ -621,13 +621,13 @@
     <w:p>
       <w:pPr>
         <w:pStyle w:val="ListBullet"/>
-        <w:spacing w:before="0" w:after="20" w:line="259" w:lineRule="auto"/>
+        <w:spacing w:before="0" w:after="24" w:line="259" w:lineRule="auto"/>
         <w:ind w:left="259"/>
       </w:pPr>
       <w:r>
         <w:rPr>
           <w:color w:val="334155"/>
-          <w:sz w:val="17"/>
+          <w:sz w:val="16"/>
         </w:rPr>
         <w:t>Engineered a distributed multi-room WebSocket backend scaling across workers using reference-counted Redis Pub/Sub channels (one channel per active room).</w:t>
       </w:r>
@@ -635,13 +635,13 @@
     <w:p>
       <w:pPr>
         <w:pStyle w:val="ListBullet"/>
-        <w:spacing w:before="0" w:after="20" w:line="259" w:lineRule="auto"/>
+        <w:spacing w:before="0" w:after="24" w:line="259" w:lineRule="auto"/>
         <w:ind w:left="259"/>
       </w:pPr>
       <w:r>
         <w:rPr>
           <w:color w:val="334155"/>
-          <w:sz w:val="17"/>
+          <w:sz w:val="16"/>
         </w:rPr>
         <w:t>Implemented JWT authentication during WebSocket handshakes, Redis hash presence tracking with multi-device deduplication, and cursor-paginated message history (15 msgs/page).</w:t>
       </w:r>
@@ -649,13 +649,13 @@
     <w:p>
       <w:pPr>
         <w:pStyle w:val="ListBullet"/>
-        <w:spacing w:before="0" w:after="20" w:line="259" w:lineRule="auto"/>
+        <w:spacing w:before="0" w:after="24" w:line="259" w:lineRule="auto"/>
         <w:ind w:left="259"/>
       </w:pPr>
       <w:r>
         <w:rPr>
           <w:color w:val="334155"/>
-          <w:sz w:val="17"/>
+          <w:sz w:val="16"/>
         </w:rPr>
         <w:t>Authored cross-process integration test suites verifying synchronized multi-worker message delivery and connection fault isolation.</w:t>
       </w:r>
@@ -663,7 +663,7 @@
     <w:p>
       <w:pPr>
         <w:keepNext/>
-        <w:spacing w:before="80" w:after="30"/>
+        <w:spacing w:before="190" w:after="50"/>
         <w:pBdr>
           <w:bottom w:val="single" w:sz="6" w:space="1" w:color="94A3B8"/>
         </w:pBdr>
@@ -701,13 +701,13 @@
           </w:tcPr>
           <w:p>
             <w:pPr>
-              <w:spacing w:before="40" w:after="10"/>
+              <w:spacing w:before="30" w:after="10"/>
             </w:pPr>
             <w:r>
               <w:rPr>
                 <w:b/>
                 <w:color w:val="0F172A"/>
-                <w:sz w:val="18"/>
+                <w:sz w:val="17"/>
               </w:rPr>
               <w:t>Freelance Software &amp; AI Engineer</w:t>
             </w:r>
@@ -715,7 +715,7 @@
               <w:rPr>
                 <w:i/>
                 <w:color w:val="475569"/>
-                <w:sz w:val="17"/>
+                <w:sz w:val="16"/>
               </w:rPr>
               <w:t xml:space="preserve"> | Independent Engineering &amp; Consulting</w:t>
             </w:r>
@@ -733,20 +733,20 @@
           </w:tcPr>
           <w:p>
             <w:pPr>
-              <w:spacing w:before="40" w:after="10"/>
+              <w:spacing w:before="30" w:after="10"/>
               <w:jc w:val="right"/>
             </w:pPr>
             <w:r>
               <w:rPr>
                 <w:b/>
                 <w:color w:val="0F172A"/>
-                <w:sz w:val="17"/>
+                <w:sz w:val="16"/>
               </w:rPr>
               <w:t>Jan 2025 – Present</w:t>
             </w:r>
             <w:r>
               <w:rPr>
-                <w:sz w:val="16"/>
+                <w:sz w:val="15"/>
               </w:rPr>
               <w:t xml:space="preserve">  (Remote)</w:t>
             </w:r>
@@ -757,13 +757,13 @@
     <w:p>
       <w:pPr>
         <w:pStyle w:val="ListBullet"/>
-        <w:spacing w:before="0" w:after="20" w:line="259" w:lineRule="auto"/>
+        <w:spacing w:before="0" w:after="24" w:line="259" w:lineRule="auto"/>
         <w:ind w:left="259"/>
       </w:pPr>
       <w:r>
         <w:rPr>
           <w:color w:val="334155"/>
-          <w:sz w:val="17"/>
+          <w:sz w:val="16"/>
         </w:rPr>
         <w:t>Designed and delivered production-grade AI systems, RAG workflows, agentic automation pipelines, and backend APIs for international clients and product builds.</w:t>
       </w:r>
@@ -771,13 +771,13 @@
     <w:p>
       <w:pPr>
         <w:pStyle w:val="ListBullet"/>
-        <w:spacing w:before="0" w:after="20" w:line="259" w:lineRule="auto"/>
+        <w:spacing w:before="0" w:after="24" w:line="259" w:lineRule="auto"/>
         <w:ind w:left="259"/>
       </w:pPr>
       <w:r>
         <w:rPr>
           <w:color w:val="334155"/>
-          <w:sz w:val="17"/>
+          <w:sz w:val="16"/>
         </w:rPr>
         <w:t>Implemented rigorous evaluation harnesses, safety guardrails, and deterministic tool-use boundaries across web, voice, and developer automation applications.</w:t>
       </w:r>
@@ -806,13 +806,13 @@
           </w:tcPr>
           <w:p>
             <w:pPr>
-              <w:spacing w:before="40" w:after="10"/>
+              <w:spacing w:before="70" w:after="10"/>
             </w:pPr>
             <w:r>
               <w:rPr>
                 <w:b/>
                 <w:color w:val="0F172A"/>
-                <w:sz w:val="18"/>
+                <w:sz w:val="17"/>
               </w:rPr>
               <w:t>Electrical &amp; Automation Engineering Intern</w:t>
             </w:r>
@@ -820,7 +820,7 @@
               <w:rPr>
                 <w:i/>
                 <w:color w:val="475569"/>
-                <w:sz w:val="17"/>
+                <w:sz w:val="16"/>
               </w:rPr>
               <w:t xml:space="preserve"> | Promasidor Nigeria Limited</w:t>
             </w:r>
@@ -838,20 +838,20 @@
           </w:tcPr>
           <w:p>
             <w:pPr>
-              <w:spacing w:before="40" w:after="10"/>
+              <w:spacing w:before="70" w:after="10"/>
               <w:jc w:val="right"/>
             </w:pPr>
             <w:r>
               <w:rPr>
                 <w:b/>
                 <w:color w:val="0F172A"/>
-                <w:sz w:val="17"/>
+                <w:sz w:val="16"/>
               </w:rPr>
               <w:t>May 2024 – Sep 2024</w:t>
             </w:r>
             <w:r>
               <w:rPr>
-                <w:sz w:val="16"/>
+                <w:sz w:val="15"/>
               </w:rPr>
               <w:t xml:space="preserve">  (Lagos, NG)</w:t>
             </w:r>
@@ -862,13 +862,13 @@
     <w:p>
       <w:pPr>
         <w:pStyle w:val="ListBullet"/>
-        <w:spacing w:before="0" w:after="20" w:line="259" w:lineRule="auto"/>
+        <w:spacing w:before="0" w:after="24" w:line="259" w:lineRule="auto"/>
         <w:ind w:left="259"/>
       </w:pPr>
       <w:r>
         <w:rPr>
           <w:color w:val="334155"/>
-          <w:sz w:val="17"/>
+          <w:sz w:val="16"/>
         </w:rPr>
         <w:t>Supported maintenance, diagnostic troubleshooting, and optimization of automated PLC-driven production-line systems in a high-volume FMCG manufacturing facility.</w:t>
       </w:r>
@@ -876,13 +876,13 @@
     <w:p>
       <w:pPr>
         <w:pStyle w:val="ListBullet"/>
-        <w:spacing w:before="0" w:after="20" w:line="259" w:lineRule="auto"/>
+        <w:spacing w:before="0" w:after="24" w:line="259" w:lineRule="auto"/>
         <w:ind w:left="259"/>
       </w:pPr>
       <w:r>
         <w:rPr>
           <w:color w:val="334155"/>
-          <w:sz w:val="17"/>
+          <w:sz w:val="16"/>
         </w:rPr>
         <w:t>Applied structured root-cause analysis (RCA) to resolve electrical and sensor faults, cutting recurring downtime; documented 5+ automation workflows and SOPs.</w:t>
       </w:r>
@@ -911,13 +911,13 @@
           </w:tcPr>
           <w:p>
             <w:pPr>
-              <w:spacing w:before="40" w:after="10"/>
+              <w:spacing w:before="70" w:after="10"/>
             </w:pPr>
             <w:r>
               <w:rPr>
                 <w:b/>
                 <w:color w:val="0F172A"/>
-                <w:sz w:val="18"/>
+                <w:sz w:val="17"/>
               </w:rPr>
               <w:t>Student Research Assistant</w:t>
             </w:r>
@@ -925,7 +925,7 @@
               <w:rPr>
                 <w:i/>
                 <w:color w:val="475569"/>
-                <w:sz w:val="17"/>
+                <w:sz w:val="16"/>
               </w:rPr>
               <w:t xml:space="preserve"> | Communication Research Group &amp; Control Systems Lab</w:t>
             </w:r>
@@ -943,20 +943,20 @@
           </w:tcPr>
           <w:p>
             <w:pPr>
-              <w:spacing w:before="40" w:after="10"/>
+              <w:spacing w:before="70" w:after="10"/>
               <w:jc w:val="right"/>
             </w:pPr>
             <w:r>
               <w:rPr>
                 <w:b/>
                 <w:color w:val="0F172A"/>
-                <w:sz w:val="17"/>
+                <w:sz w:val="16"/>
               </w:rPr>
               <w:t>2020 – 2025</w:t>
             </w:r>
             <w:r>
               <w:rPr>
-                <w:sz w:val="16"/>
+                <w:sz w:val="15"/>
               </w:rPr>
               <w:t xml:space="preserve">  (OAU, NG)</w:t>
             </w:r>
@@ -967,13 +967,13 @@
     <w:p>
       <w:pPr>
         <w:pStyle w:val="ListBullet"/>
-        <w:spacing w:before="0" w:after="20" w:line="259" w:lineRule="auto"/>
+        <w:spacing w:before="0" w:after="24" w:line="259" w:lineRule="auto"/>
         <w:ind w:left="259"/>
       </w:pPr>
       <w:r>
         <w:rPr>
           <w:color w:val="334155"/>
-          <w:sz w:val="17"/>
+          <w:sz w:val="16"/>
         </w:rPr>
         <w:t>Co-developed an IoT-compatible telemetry station and simulated sensor-to-microcontroller data transmission using MATLAB and Simulink.</w:t>
       </w:r>
@@ -981,13 +981,13 @@
     <w:p>
       <w:pPr>
         <w:pStyle w:val="ListBullet"/>
-        <w:spacing w:before="0" w:after="20" w:line="259" w:lineRule="auto"/>
+        <w:spacing w:before="0" w:after="24" w:line="259" w:lineRule="auto"/>
         <w:ind w:left="259"/>
       </w:pPr>
       <w:r>
         <w:rPr>
           <w:color w:val="334155"/>
-          <w:sz w:val="17"/>
+          <w:sz w:val="16"/>
         </w:rPr>
         <w:t>Modeled Signal-to-Noise Ratio (SNR) across wireless configurations and contributed to smart metering prototypes for service-based tariff billing.</w:t>
       </w:r>
@@ -995,7 +995,7 @@
     <w:p>
       <w:pPr>
         <w:keepNext/>
-        <w:spacing w:before="80" w:after="30"/>
+        <w:spacing w:before="190" w:after="50"/>
         <w:pBdr>
           <w:bottom w:val="single" w:sz="6" w:space="1" w:color="94A3B8"/>
         </w:pBdr>
@@ -1033,13 +1033,13 @@
           </w:tcPr>
           <w:p>
             <w:pPr>
-              <w:spacing w:before="40" w:after="10"/>
+              <w:spacing w:before="30" w:after="10"/>
             </w:pPr>
             <w:r>
               <w:rPr>
                 <w:b/>
                 <w:color w:val="0F172A"/>
-                <w:sz w:val="18"/>
+                <w:sz w:val="17"/>
               </w:rPr>
               <w:t>B.Eng., Electrical &amp; Electronics Engineering</w:t>
             </w:r>
@@ -1047,7 +1047,7 @@
               <w:rPr>
                 <w:i/>
                 <w:color w:val="475569"/>
-                <w:sz w:val="17"/>
+                <w:sz w:val="16"/>
               </w:rPr>
               <w:t xml:space="preserve"> | Obafemi Awolowo University</w:t>
             </w:r>
@@ -1065,20 +1065,20 @@
           </w:tcPr>
           <w:p>
             <w:pPr>
-              <w:spacing w:before="40" w:after="10"/>
+              <w:spacing w:before="30" w:after="10"/>
               <w:jc w:val="right"/>
             </w:pPr>
             <w:r>
               <w:rPr>
                 <w:b/>
                 <w:color w:val="0F172A"/>
-                <w:sz w:val="17"/>
+                <w:sz w:val="16"/>
               </w:rPr>
               <w:t>2019 – 2025</w:t>
             </w:r>
             <w:r>
               <w:rPr>
-                <w:sz w:val="16"/>
+                <w:sz w:val="15"/>
               </w:rPr>
               <w:t xml:space="preserve">  (Ile-Ife, Nigeria)</w:t>
             </w:r>
@@ -1088,7 +1088,7 @@
     </w:tbl>
     <w:p>
       <w:pPr>
-        <w:spacing w:before="20" w:after="20"/>
+        <w:spacing w:before="30" w:after="20"/>
       </w:pPr>
       <w:r>
         <w:rPr>
@@ -1106,7 +1106,7 @@
     </w:p>
     <w:sectPr>
       <w:pgSz w:w="12240" w:h="15840"/>
-      <w:pgMar w:top="576" w:right="720" w:bottom="576" w:left="720" w:header="720" w:footer="720" w:gutter="0"/>
+      <w:pgMar w:top="504" w:right="720" w:bottom="504" w:left="720" w:header="720" w:footer="720" w:gutter="0"/>
       <w:cols w:space="720"/>
       <w:docGrid w:linePitch="360"/>
     </w:sectPr>
@@ -1480,7 +1480,7 @@
     <w:rPr>
       <w:rFonts w:ascii="Calibri" w:hAnsi="Calibri"/>
       <w:color w:val="334155"/>
-      <w:sz w:val="18"/>
+      <w:sz w:val="17"/>
     </w:rPr>
   </w:style>
   <w:style w:type="paragraph" w:styleId="Header">

</xml_diff>